<commit_message>
Day10-CodeGenerator: guard core AI call, fix system-prompt typos, add project.md
GetChatMessageContentAsync was unguarded - a transient failure or
safety-filter rejection would crash the session and lose every
in-memory snippet. Wraps it in try/catch. Also fixes "Always user
modern .NET 8 syntax" -> "Always use modern C# syntax" and "Not
conversational filter" -> "No conversational filler." in the
student-visible system prompt text. Syncs the docx's Complete Code
listing and Code Walkthrough prose, and replaces missing.md with
project.md.
</commit_message>
<xml_diff>
--- a/Day10-CodeGenerator.docx
+++ b/Day10-CodeGenerator.docx
@@ -133,7 +133,11 @@
         <w:t>Low-Temperature / Low-TopP Execution Settings for Deterministic Output</w:t>
       </w:r>
       <w:r>
-        <w:t>: `GeminiPromptExecutionSettings { Temperature = 0.2, TopP = 0.1 }` intentionally narrows the model's token choices, which matters specifically for code generation where you want the same reasonable answer every time rather than creative variety.</w:t>
+        <w:t xml:space="preserve">: `GeminiPromptExecutionSettings { Temperature = 0.2, TopP = 0.1 }` intentionally narrows the model's token choices, which matters specifically for code </w:t>
+      </w:r>
+      <w:r>
+        <w:lastRenderedPageBreak/>
+        <w:t>generation where you want the same reasonable answer every time rather than creative variety.</w:t>
       </w:r>
     </w:p>
     <w:p>
@@ -576,6 +580,7 @@
           <w:rFonts w:ascii="Consolas" w:hAnsi="Consolas"/>
           <w:sz w:val="19"/>
         </w:rPr>
+        <w:lastRenderedPageBreak/>
         <w:t xml:space="preserve">            var apiKey = Environment.GetEnvironmentVariable("GEMINI_API_KEY")</w:t>
       </w:r>
     </w:p>
@@ -763,7 +768,21 @@
           <w:rFonts w:ascii="Consolas" w:hAnsi="Consolas"/>
           <w:sz w:val="19"/>
         </w:rPr>
-        <w:t xml:space="preserve">                "1. Always user modern .NET 8 syntax (file-scoped namespaces, primary constructors where applicable). " +</w:t>
+        <w:t xml:space="preserve">                "</w:t>
+      </w:r>
+      <w:r>
+        <w:rPr>
+          <w:rFonts w:ascii="Consolas" w:hAnsi="Consolas"/>
+          <w:sz w:val="19"/>
+        </w:rPr>
+        <w:t xml:space="preserve">1. Always use modern C# syntax (file-scoped namespaces, primary constructors where applicable). </w:t>
+      </w:r>
+      <w:r>
+        <w:rPr>
+          <w:rFonts w:ascii="Consolas" w:hAnsi="Consolas"/>
+          <w:sz w:val="19"/>
+        </w:rPr>
+        <w:t>" +</w:t>
       </w:r>
     </w:p>
     <w:p>
@@ -811,7 +830,21 @@
           <w:rFonts w:ascii="Consolas" w:hAnsi="Consolas"/>
           <w:sz w:val="19"/>
         </w:rPr>
-        <w:t xml:space="preserve">                "4. Output only the code within markdown blocks.  Not conversational filter."</w:t>
+        <w:t xml:space="preserve">                "</w:t>
+      </w:r>
+      <w:r>
+        <w:rPr>
+          <w:rFonts w:ascii="Consolas" w:hAnsi="Consolas"/>
+          <w:sz w:val="19"/>
+        </w:rPr>
+        <w:t>4. Output only the code within markdown blocks. No conversational filler.</w:t>
+      </w:r>
+      <w:r>
+        <w:rPr>
+          <w:rFonts w:ascii="Consolas" w:hAnsi="Consolas"/>
+          <w:sz w:val="19"/>
+        </w:rPr>
+        <w:t>"</w:t>
       </w:r>
     </w:p>
     <w:p>
@@ -1137,23 +1170,55 @@
           <w:rFonts w:ascii="Consolas" w:hAnsi="Consolas"/>
           <w:sz w:val="19"/>
         </w:rPr>
-        <w:t xml:space="preserve">                var response = await chatService.GetChatMessageContentAsync(chatHistory, settings, kernel);</w:t>
-      </w:r>
-    </w:p>
-    <w:p>
-      <w:pPr>
-        <w:pStyle w:val="NoSpacing"/>
-        <w:rPr>
-          <w:rFonts w:ascii="Consolas" w:hAnsi="Consolas"/>
-          <w:sz w:val="19"/>
-        </w:rPr>
-      </w:pPr>
-      <w:r>
-        <w:rPr>
-          <w:rFonts w:ascii="Consolas" w:hAnsi="Consolas"/>
-          <w:sz w:val="19"/>
-        </w:rPr>
-        <w:t xml:space="preserve">                if (response.Content != null)</w:t>
+        <w:t xml:space="preserve">                // 4. Guard the model call: a transient API error or safety-filter</w:t>
+      </w:r>
+    </w:p>
+    <w:p>
+      <w:pPr>
+        <w:pStyle w:val="NoSpacing"/>
+        <w:rPr>
+          <w:rFonts w:ascii="Consolas" w:hAnsi="Consolas"/>
+          <w:sz w:val="19"/>
+        </w:rPr>
+      </w:pPr>
+      <w:r>
+        <w:rPr>
+          <w:rFonts w:ascii="Consolas" w:hAnsi="Consolas"/>
+          <w:sz w:val="19"/>
+        </w:rPr>
+        <w:t xml:space="preserve">                // rejection would otherwise crash the whole session and lose every</w:t>
+      </w:r>
+    </w:p>
+    <w:p>
+      <w:pPr>
+        <w:pStyle w:val="NoSpacing"/>
+        <w:rPr>
+          <w:rFonts w:ascii="Consolas" w:hAnsi="Consolas"/>
+          <w:sz w:val="19"/>
+        </w:rPr>
+      </w:pPr>
+      <w:r>
+        <w:rPr>
+          <w:rFonts w:ascii="Consolas" w:hAnsi="Consolas"/>
+          <w:sz w:val="19"/>
+        </w:rPr>
+        <w:t xml:space="preserve">                // snippet generated so far, since it only ever lived in memory.</w:t>
+      </w:r>
+    </w:p>
+    <w:p>
+      <w:pPr>
+        <w:pStyle w:val="NoSpacing"/>
+        <w:rPr>
+          <w:rFonts w:ascii="Consolas" w:hAnsi="Consolas"/>
+          <w:sz w:val="19"/>
+        </w:rPr>
+      </w:pPr>
+      <w:r>
+        <w:rPr>
+          <w:rFonts w:ascii="Consolas" w:hAnsi="Consolas"/>
+          <w:sz w:val="19"/>
+        </w:rPr>
+        <w:t xml:space="preserve">                try</w:t>
       </w:r>
     </w:p>
     <w:p>
@@ -1185,48 +1250,113 @@
           <w:rFonts w:ascii="Consolas" w:hAnsi="Consolas"/>
           <w:sz w:val="19"/>
         </w:rPr>
-        <w:t xml:space="preserve">                    Console.WriteLine(response.Content);</w:t>
-      </w:r>
-    </w:p>
-    <w:p>
-      <w:pPr>
-        <w:pStyle w:val="NoSpacing"/>
-        <w:rPr>
-          <w:rFonts w:ascii="Consolas" w:hAnsi="Consolas"/>
-          <w:sz w:val="19"/>
-        </w:rPr>
-      </w:pPr>
-    </w:p>
-    <w:p>
-      <w:pPr>
-        <w:pStyle w:val="NoSpacing"/>
-        <w:rPr>
-          <w:rFonts w:ascii="Consolas" w:hAnsi="Consolas"/>
-          <w:sz w:val="19"/>
-        </w:rPr>
-      </w:pPr>
-      <w:r>
-        <w:rPr>
-          <w:rFonts w:ascii="Consolas" w:hAnsi="Consolas"/>
-          <w:sz w:val="19"/>
-        </w:rPr>
-        <w:t xml:space="preserve">                    // Add to history so the agent can "refactor" or "debug" in the next turn.</w:t>
-      </w:r>
-    </w:p>
-    <w:p>
-      <w:pPr>
-        <w:pStyle w:val="NoSpacing"/>
-        <w:rPr>
-          <w:rFonts w:ascii="Consolas" w:hAnsi="Consolas"/>
-          <w:sz w:val="19"/>
-        </w:rPr>
-      </w:pPr>
-      <w:r>
-        <w:rPr>
-          <w:rFonts w:ascii="Consolas" w:hAnsi="Consolas"/>
-          <w:sz w:val="19"/>
-        </w:rPr>
-        <w:t xml:space="preserve">                    chatHistory.AddAssistantMessage(response.Content);</w:t>
+        <w:t xml:space="preserve">                    var response = await chatService.GetChatMessageContentAsync(chatHistory, settings, kernel);</w:t>
+      </w:r>
+    </w:p>
+    <w:p>
+      <w:pPr>
+        <w:pStyle w:val="NoSpacing"/>
+        <w:rPr>
+          <w:rFonts w:ascii="Consolas" w:hAnsi="Consolas"/>
+          <w:sz w:val="19"/>
+        </w:rPr>
+      </w:pPr>
+      <w:r>
+        <w:rPr>
+          <w:rFonts w:ascii="Consolas" w:hAnsi="Consolas"/>
+          <w:sz w:val="19"/>
+        </w:rPr>
+        <w:t xml:space="preserve">                    if (response.Content != null)</w:t>
+      </w:r>
+    </w:p>
+    <w:p>
+      <w:pPr>
+        <w:pStyle w:val="NoSpacing"/>
+        <w:rPr>
+          <w:rFonts w:ascii="Consolas" w:hAnsi="Consolas"/>
+          <w:sz w:val="19"/>
+        </w:rPr>
+      </w:pPr>
+      <w:r>
+        <w:rPr>
+          <w:rFonts w:ascii="Consolas" w:hAnsi="Consolas"/>
+          <w:sz w:val="19"/>
+        </w:rPr>
+        <w:t xml:space="preserve">                    {</w:t>
+      </w:r>
+    </w:p>
+    <w:p>
+      <w:pPr>
+        <w:pStyle w:val="NoSpacing"/>
+        <w:rPr>
+          <w:rFonts w:ascii="Consolas" w:hAnsi="Consolas"/>
+          <w:sz w:val="19"/>
+        </w:rPr>
+      </w:pPr>
+      <w:r>
+        <w:rPr>
+          <w:rFonts w:ascii="Consolas" w:hAnsi="Consolas"/>
+          <w:sz w:val="19"/>
+        </w:rPr>
+        <w:t xml:space="preserve">                        Console.WriteLine(response.Content);</w:t>
+      </w:r>
+    </w:p>
+    <w:p>
+      <w:pPr>
+        <w:pStyle w:val="NoSpacing"/>
+        <w:rPr>
+          <w:rFonts w:ascii="Consolas" w:hAnsi="Consolas"/>
+          <w:sz w:val="19"/>
+        </w:rPr>
+      </w:pPr>
+    </w:p>
+    <w:p>
+      <w:pPr>
+        <w:pStyle w:val="NoSpacing"/>
+        <w:rPr>
+          <w:rFonts w:ascii="Consolas" w:hAnsi="Consolas"/>
+          <w:sz w:val="19"/>
+        </w:rPr>
+      </w:pPr>
+      <w:r>
+        <w:rPr>
+          <w:rFonts w:ascii="Consolas" w:hAnsi="Consolas"/>
+          <w:sz w:val="19"/>
+        </w:rPr>
+        <w:lastRenderedPageBreak/>
+        <w:t xml:space="preserve">                        // Add to history so the agent can "refactor" or "debug" in the next turn.</w:t>
+      </w:r>
+    </w:p>
+    <w:p>
+      <w:pPr>
+        <w:pStyle w:val="NoSpacing"/>
+        <w:rPr>
+          <w:rFonts w:ascii="Consolas" w:hAnsi="Consolas"/>
+          <w:sz w:val="19"/>
+        </w:rPr>
+      </w:pPr>
+      <w:r>
+        <w:rPr>
+          <w:rFonts w:ascii="Consolas" w:hAnsi="Consolas"/>
+          <w:sz w:val="19"/>
+        </w:rPr>
+        <w:t xml:space="preserve">                        chatHistory.AddAssistantMessage(response.Content);</w:t>
+      </w:r>
+    </w:p>
+    <w:p>
+      <w:pPr>
+        <w:pStyle w:val="NoSpacing"/>
+        <w:rPr>
+          <w:rFonts w:ascii="Consolas" w:hAnsi="Consolas"/>
+          <w:sz w:val="19"/>
+        </w:rPr>
+      </w:pPr>
+      <w:r>
+        <w:rPr>
+          <w:rFonts w:ascii="Consolas" w:hAnsi="Consolas"/>
+          <w:sz w:val="19"/>
+        </w:rPr>
+        <w:t xml:space="preserve">                    }</w:t>
       </w:r>
     </w:p>
     <w:p>
@@ -1258,6 +1388,70 @@
           <w:rFonts w:ascii="Consolas" w:hAnsi="Consolas"/>
           <w:sz w:val="19"/>
         </w:rPr>
+        <w:t xml:space="preserve">                catch (Exception ex)</w:t>
+      </w:r>
+    </w:p>
+    <w:p>
+      <w:pPr>
+        <w:pStyle w:val="NoSpacing"/>
+        <w:rPr>
+          <w:rFonts w:ascii="Consolas" w:hAnsi="Consolas"/>
+          <w:sz w:val="19"/>
+        </w:rPr>
+      </w:pPr>
+      <w:r>
+        <w:rPr>
+          <w:rFonts w:ascii="Consolas" w:hAnsi="Consolas"/>
+          <w:sz w:val="19"/>
+        </w:rPr>
+        <w:t xml:space="preserve">                {</w:t>
+      </w:r>
+    </w:p>
+    <w:p>
+      <w:pPr>
+        <w:pStyle w:val="NoSpacing"/>
+        <w:rPr>
+          <w:rFonts w:ascii="Consolas" w:hAnsi="Consolas"/>
+          <w:sz w:val="19"/>
+        </w:rPr>
+      </w:pPr>
+      <w:r>
+        <w:rPr>
+          <w:rFonts w:ascii="Consolas" w:hAnsi="Consolas"/>
+          <w:sz w:val="19"/>
+        </w:rPr>
+        <w:t xml:space="preserve">                    Console.WriteLine($"\n[Error] The request failed: {ex.Message}\nYou can try again or type 'exit'.");</w:t>
+      </w:r>
+    </w:p>
+    <w:p>
+      <w:pPr>
+        <w:pStyle w:val="NoSpacing"/>
+        <w:rPr>
+          <w:rFonts w:ascii="Consolas" w:hAnsi="Consolas"/>
+          <w:sz w:val="19"/>
+        </w:rPr>
+      </w:pPr>
+      <w:r>
+        <w:rPr>
+          <w:rFonts w:ascii="Consolas" w:hAnsi="Consolas"/>
+          <w:sz w:val="19"/>
+        </w:rPr>
+        <w:t xml:space="preserve">                }</w:t>
+      </w:r>
+    </w:p>
+    <w:p>
+      <w:pPr>
+        <w:pStyle w:val="NoSpacing"/>
+        <w:rPr>
+          <w:rFonts w:ascii="Consolas" w:hAnsi="Consolas"/>
+          <w:sz w:val="19"/>
+        </w:rPr>
+      </w:pPr>
+      <w:r>
+        <w:rPr>
+          <w:rFonts w:ascii="Consolas" w:hAnsi="Consolas"/>
+          <w:sz w:val="19"/>
+        </w:rPr>
         <w:t xml:space="preserve">            }</w:t>
       </w:r>
     </w:p>
@@ -1338,7 +1532,13 @@
         <w:t>Step 2: A Persona Defined by Output Rules, Not Just Tone.</w:t>
       </w:r>
       <w:r>
-        <w:t xml:space="preserve"> Where Day 9's system prompt mostly governed conversational *behavior* (ask one question, probe vague answers), this one is dominated by output-*format* rules: use modern .NET 8 syntax, include XML doc comments, be self-contained, and — critically — output nothing but a fenced code block with no conversational filler. This is a common and important prompt-engineering technique: if you want an agent's output to be machine- or pipeline-friendly (here, feeding into Day 11's Critic), you have to say so explicitly, because a chat model's natural instinct is to add explanatory prose around code.</w:t>
+        <w:t xml:space="preserve"> Where Day 9's system prompt mostly governed conversational *behavior* (ask one question, probe vague answers), this one is dominated by output-*format* rules: </w:t>
+      </w:r>
+      <w:r>
+        <w:t>use modern C# syntax, include XML doc comments</w:t>
+      </w:r>
+      <w:r>
+        <w:t>, be self-contained, and — critically — output nothing but a fenced code block with no conversational filler. This is a common and important prompt-engineering technique: if you want an agent's output to be machine- or pipeline-friendly (here, feeding into Day 11's Critic), you have to say so explicitly, because a chat model's natural instinct is to add explanatory prose around code.</w:t>
       </w:r>
     </w:p>
     <w:p/>
@@ -1362,7 +1562,11 @@
         <w:t>Step 4: Temperature and TopP as a Determinism Dial.</w:t>
       </w:r>
       <w:r>
-        <w:t xml:space="preserve"> `Temperature = 0.2, TopP = 0.1` are both very low. Temperature controls how "random" the model's next-token choices are; TopP further restricts the pool of candidate tokens it's allowed to sample from. Combined, these settings push the model toward its single most likely, most "boring" answer every time — exactly what you want from a code generator, where two different runs producing two different implementations of the same request would be confusing and hard to critique consistently. Contrast this with Day 9's `Temperature = 0.7` (natural conversational variety is desirable there) and Day 11's `Temperature = 0.0` (a critic should be maximally consistent).</w:t>
+        <w:t xml:space="preserve"> `Temperature = 0.2, TopP = 0.1` are both very low. Temperature controls how "random" the model's next-token choices are; TopP further restricts the pool of candidate tokens it's allowed to sample from. Combined, </w:t>
+      </w:r>
+      <w:r>
+        <w:lastRenderedPageBreak/>
+        <w:t>these settings push the model toward its single most likely, most "boring" answer every time — exactly what you want from a code generator, where two different runs producing two different implementations of the same request would be confusing and hard to critique consistently. Contrast this with Day 9's `Temperature = 0.7` (natural conversational variety is desirable there) and Day 11's `Temperature = 0.0` (a critic should be maximally consistent).</w:t>
       </w:r>
     </w:p>
     <w:p/>
@@ -1510,6 +1714,7 @@
     </w:p>
     <w:p>
       <w:r>
+        <w:lastRenderedPageBreak/>
         <w:t xml:space="preserve">    /// &lt;/summary&gt;</w:t>
       </w:r>
     </w:p>

</xml_diff>